<commit_message>
Finalize Selenium software testing project documentation
</commit_message>
<xml_diff>
--- a/semester-02-spring-2024/object-oriented-programming/firewall_tutor_oop-csharp/docs/Project-Report.docx
+++ b/semester-02-spring-2024/object-oriented-programming/firewall_tutor_oop-csharp/docs/Project-Report.docx
@@ -1,6 +1,6 @@
 
 <file path=word/document.xml><?xml version="1.0" encoding="utf-8"?>
-<w:document xmlns:wpc="http://schemas.microsoft.com/office/word/2010/wordprocessingCanvas" xmlns:cx="http://schemas.microsoft.com/office/drawing/2014/chartex" xmlns:cx1="http://schemas.microsoft.com/office/drawing/2015/9/8/chartex" xmlns:cx2="http://schemas.microsoft.com/office/drawing/2015/10/21/chartex" xmlns:cx3="http://schemas.microsoft.com/office/drawing/2016/5/9/chartex" xmlns:cx4="http://schemas.microsoft.com/office/drawing/2016/5/10/chartex" xmlns:cx5="http://schemas.microsoft.com/office/drawing/2016/5/11/chartex" xmlns:cx6="http://schemas.microsoft.com/office/drawing/2016/5/12/chartex" xmlns:cx7="http://schemas.microsoft.com/office/drawing/2016/5/13/chartex" xmlns:cx8="http://schemas.microsoft.com/office/drawing/2016/5/14/chartex" xmlns:mc="http://schemas.openxmlformats.org/markup-compatibility/2006" xmlns:aink="http://schemas.microsoft.com/office/drawing/2016/ink" xmlns:am3d="http://schemas.microsoft.com/office/drawing/2017/model3d" xmlns:o="urn:schemas-microsoft-com:office:office" xmlns:r="http://schemas.openxmlformats.org/officeDocument/2006/relationships" xmlns:m="http://schemas.openxmlformats.org/officeDocument/2006/math" xmlns:v="urn:schemas-microsoft-com:vml" xmlns:wp14="http://schemas.microsoft.com/office/word/2010/wordprocessingDrawing" xmlns:wp="http://schemas.openxmlformats.org/drawingml/2006/wordprocessingDrawing" xmlns:w10="urn:schemas-microsoft-com:office:word" xmlns:w="http://schemas.openxmlformats.org/wordprocessingml/2006/main" xmlns:w14="http://schemas.microsoft.com/office/word/2010/wordml" xmlns:w15="http://schemas.microsoft.com/office/word/2012/wordml" xmlns:w16cex="http://schemas.microsoft.com/office/word/2018/wordml/cex" xmlns:w16cid="http://schemas.microsoft.com/office/word/2016/wordml/cid" xmlns:w16="http://schemas.microsoft.com/office/word/2018/wordml" xmlns:w16sdtdh="http://schemas.microsoft.com/office/word/2020/wordml/sdtdatahash" xmlns:w16se="http://schemas.microsoft.com/office/word/2015/wordml/symex" xmlns:wpg="http://schemas.microsoft.com/office/word/2010/wordprocessingGroup" xmlns:wpi="http://schemas.microsoft.com/office/word/2010/wordprocessingInk" xmlns:wne="http://schemas.microsoft.com/office/word/2006/wordml" xmlns:wps="http://schemas.microsoft.com/office/word/2010/wordprocessingShape" mc:Ignorable="w14 w15 w16se w16cid w16 w16cex w16sdtdh wp14">
+<w:document xmlns:wpc="http://schemas.microsoft.com/office/word/2010/wordprocessingCanvas" xmlns:cx="http://schemas.microsoft.com/office/drawing/2014/chartex" xmlns:cx1="http://schemas.microsoft.com/office/drawing/2015/9/8/chartex" xmlns:cx2="http://schemas.microsoft.com/office/drawing/2015/10/21/chartex" xmlns:cx3="http://schemas.microsoft.com/office/drawing/2016/5/9/chartex" xmlns:cx4="http://schemas.microsoft.com/office/drawing/2016/5/10/chartex" xmlns:cx5="http://schemas.microsoft.com/office/drawing/2016/5/11/chartex" xmlns:cx6="http://schemas.microsoft.com/office/drawing/2016/5/12/chartex" xmlns:cx7="http://schemas.microsoft.com/office/drawing/2016/5/13/chartex" xmlns:cx8="http://schemas.microsoft.com/office/drawing/2016/5/14/chartex" xmlns:mc="http://schemas.openxmlformats.org/markup-compatibility/2006" xmlns:aink="http://schemas.microsoft.com/office/drawing/2016/ink" xmlns:am3d="http://schemas.microsoft.com/office/drawing/2017/model3d" xmlns:o="urn:schemas-microsoft-com:office:office" xmlns:oel="http://schemas.microsoft.com/office/2019/extlst" xmlns:r="http://schemas.openxmlformats.org/officeDocument/2006/relationships" xmlns:m="http://schemas.openxmlformats.org/officeDocument/2006/math" xmlns:v="urn:schemas-microsoft-com:vml" xmlns:wp14="http://schemas.microsoft.com/office/word/2010/wordprocessingDrawing" xmlns:wp="http://schemas.openxmlformats.org/drawingml/2006/wordprocessingDrawing" xmlns:w10="urn:schemas-microsoft-com:office:word" xmlns:w="http://schemas.openxmlformats.org/wordprocessingml/2006/main" xmlns:w14="http://schemas.microsoft.com/office/word/2010/wordml" xmlns:w15="http://schemas.microsoft.com/office/word/2012/wordml" xmlns:w16cex="http://schemas.microsoft.com/office/word/2018/wordml/cex" xmlns:w16cid="http://schemas.microsoft.com/office/word/2016/wordml/cid" xmlns:w16="http://schemas.microsoft.com/office/word/2018/wordml" xmlns:w16sdtdh="http://schemas.microsoft.com/office/word/2020/wordml/sdtdatahash" xmlns:w16se="http://schemas.microsoft.com/office/word/2015/wordml/symex" xmlns:wpg="http://schemas.microsoft.com/office/word/2010/wordprocessingGroup" xmlns:wpi="http://schemas.microsoft.com/office/word/2010/wordprocessingInk" xmlns:wne="http://schemas.microsoft.com/office/word/2006/wordml" xmlns:wps="http://schemas.microsoft.com/office/word/2010/wordprocessingShape" mc:Ignorable="w14 w15 w16se w16cid w16 w16cex w16sdtdh wp14">
   <w:body>
     <w:p>
       <w:pPr>
@@ -189,21 +189,12 @@
           <w:szCs w:val="28"/>
         </w:rPr>
       </w:pPr>
-      <w:proofErr w:type="spellStart"/>
-      <w:r>
-        <w:rPr>
-          <w:sz w:val="28"/>
-          <w:szCs w:val="28"/>
-        </w:rPr>
-        <w:t>Dr.</w:t>
-      </w:r>
-      <w:proofErr w:type="spellEnd"/>
-      <w:r>
-        <w:rPr>
-          <w:sz w:val="28"/>
-          <w:szCs w:val="28"/>
-        </w:rPr>
-        <w:t xml:space="preserve"> Muhammad Imran</w:t>
+      <w:r>
+        <w:rPr>
+          <w:sz w:val="28"/>
+          <w:szCs w:val="28"/>
+        </w:rPr>
+        <w:t>Dr. Muhammad Imran</w:t>
       </w:r>
     </w:p>
     <w:p>
@@ -256,14 +247,7 @@
           <w:sz w:val="28"/>
           <w:szCs w:val="28"/>
         </w:rPr>
-        <w:t>BSCYSev-S-24-</w:t>
-      </w:r>
-      <w:r>
-        <w:rPr>
-          <w:sz w:val="28"/>
-          <w:szCs w:val="28"/>
-        </w:rPr>
-        <w:t>A</w:t>
+        <w:t>BSCYSev-S-24-A</w:t>
       </w:r>
     </w:p>
     <w:p>
@@ -311,23 +295,7 @@
           <w:sz w:val="28"/>
           <w:szCs w:val="28"/>
         </w:rPr>
-        <w:t xml:space="preserve">Syed </w:t>
-      </w:r>
-      <w:proofErr w:type="spellStart"/>
-      <w:r>
-        <w:rPr>
-          <w:sz w:val="28"/>
-          <w:szCs w:val="28"/>
-        </w:rPr>
-        <w:t>Jazib</w:t>
-      </w:r>
-      <w:proofErr w:type="spellEnd"/>
-      <w:r>
-        <w:rPr>
-          <w:sz w:val="28"/>
-          <w:szCs w:val="28"/>
-        </w:rPr>
-        <w:t xml:space="preserve"> Ali Rizvi (232145)</w:t>
+        <w:t>Syed Jazib Ali Rizvi (232145)</w:t>
       </w:r>
     </w:p>
     <w:p>
@@ -363,21 +331,26 @@
           <w:szCs w:val="28"/>
         </w:rPr>
       </w:pPr>
-      <w:proofErr w:type="spellStart"/>
-      <w:r>
-        <w:rPr>
-          <w:sz w:val="28"/>
-          <w:szCs w:val="28"/>
-        </w:rPr>
-        <w:t>Sheroze</w:t>
-      </w:r>
-      <w:proofErr w:type="spellEnd"/>
-      <w:r>
-        <w:rPr>
-          <w:sz w:val="28"/>
-          <w:szCs w:val="28"/>
-        </w:rPr>
-        <w:t xml:space="preserve"> Sameer (232091)</w:t>
+      <w:r>
+        <w:rPr>
+          <w:sz w:val="28"/>
+          <w:szCs w:val="28"/>
+        </w:rPr>
+        <w:t>She</w:t>
+      </w:r>
+      <w:r>
+        <w:rPr>
+          <w:sz w:val="28"/>
+          <w:szCs w:val="28"/>
+        </w:rPr>
+        <w:t>h</w:t>
+      </w:r>
+      <w:r>
+        <w:rPr>
+          <w:sz w:val="28"/>
+          <w:szCs w:val="28"/>
+        </w:rPr>
+        <w:t>roze Sameer (232091)</w:t>
       </w:r>
     </w:p>
     <w:p>
@@ -1262,7 +1235,7 @@
 </file>
 
 <file path=word/numbering.xml><?xml version="1.0" encoding="utf-8"?>
-<w:numbering xmlns:wpc="http://schemas.microsoft.com/office/word/2010/wordprocessingCanvas" xmlns:cx="http://schemas.microsoft.com/office/drawing/2014/chartex" xmlns:cx1="http://schemas.microsoft.com/office/drawing/2015/9/8/chartex" xmlns:cx2="http://schemas.microsoft.com/office/drawing/2015/10/21/chartex" xmlns:cx3="http://schemas.microsoft.com/office/drawing/2016/5/9/chartex" xmlns:cx4="http://schemas.microsoft.com/office/drawing/2016/5/10/chartex" xmlns:cx5="http://schemas.microsoft.com/office/drawing/2016/5/11/chartex" xmlns:cx6="http://schemas.microsoft.com/office/drawing/2016/5/12/chartex" xmlns:cx7="http://schemas.microsoft.com/office/drawing/2016/5/13/chartex" xmlns:cx8="http://schemas.microsoft.com/office/drawing/2016/5/14/chartex" xmlns:mc="http://schemas.openxmlformats.org/markup-compatibility/2006" xmlns:aink="http://schemas.microsoft.com/office/drawing/2016/ink" xmlns:am3d="http://schemas.microsoft.com/office/drawing/2017/model3d" xmlns:o="urn:schemas-microsoft-com:office:office" xmlns:r="http://schemas.openxmlformats.org/officeDocument/2006/relationships" xmlns:m="http://schemas.openxmlformats.org/officeDocument/2006/math" xmlns:v="urn:schemas-microsoft-com:vml" xmlns:wp14="http://schemas.microsoft.com/office/word/2010/wordprocessingDrawing" xmlns:wp="http://schemas.openxmlformats.org/drawingml/2006/wordprocessingDrawing" xmlns:w10="urn:schemas-microsoft-com:office:word" xmlns:w="http://schemas.openxmlformats.org/wordprocessingml/2006/main" xmlns:w14="http://schemas.microsoft.com/office/word/2010/wordml" xmlns:w15="http://schemas.microsoft.com/office/word/2012/wordml" xmlns:w16cex="http://schemas.microsoft.com/office/word/2018/wordml/cex" xmlns:w16cid="http://schemas.microsoft.com/office/word/2016/wordml/cid" xmlns:w16="http://schemas.microsoft.com/office/word/2018/wordml" xmlns:w16sdtdh="http://schemas.microsoft.com/office/word/2020/wordml/sdtdatahash" xmlns:w16se="http://schemas.microsoft.com/office/word/2015/wordml/symex" xmlns:wpg="http://schemas.microsoft.com/office/word/2010/wordprocessingGroup" xmlns:wpi="http://schemas.microsoft.com/office/word/2010/wordprocessingInk" xmlns:wne="http://schemas.microsoft.com/office/word/2006/wordml" xmlns:wps="http://schemas.microsoft.com/office/word/2010/wordprocessingShape" mc:Ignorable="w14 w15 w16se w16cid w16 w16cex w16sdtdh wp14">
+<w:numbering xmlns:wpc="http://schemas.microsoft.com/office/word/2010/wordprocessingCanvas" xmlns:cx="http://schemas.microsoft.com/office/drawing/2014/chartex" xmlns:cx1="http://schemas.microsoft.com/office/drawing/2015/9/8/chartex" xmlns:cx2="http://schemas.microsoft.com/office/drawing/2015/10/21/chartex" xmlns:cx3="http://schemas.microsoft.com/office/drawing/2016/5/9/chartex" xmlns:cx4="http://schemas.microsoft.com/office/drawing/2016/5/10/chartex" xmlns:cx5="http://schemas.microsoft.com/office/drawing/2016/5/11/chartex" xmlns:cx6="http://schemas.microsoft.com/office/drawing/2016/5/12/chartex" xmlns:cx7="http://schemas.microsoft.com/office/drawing/2016/5/13/chartex" xmlns:cx8="http://schemas.microsoft.com/office/drawing/2016/5/14/chartex" xmlns:mc="http://schemas.openxmlformats.org/markup-compatibility/2006" xmlns:aink="http://schemas.microsoft.com/office/drawing/2016/ink" xmlns:am3d="http://schemas.microsoft.com/office/drawing/2017/model3d" xmlns:o="urn:schemas-microsoft-com:office:office" xmlns:oel="http://schemas.microsoft.com/office/2019/extlst" xmlns:r="http://schemas.openxmlformats.org/officeDocument/2006/relationships" xmlns:m="http://schemas.openxmlformats.org/officeDocument/2006/math" xmlns:v="urn:schemas-microsoft-com:vml" xmlns:wp14="http://schemas.microsoft.com/office/word/2010/wordprocessingDrawing" xmlns:wp="http://schemas.openxmlformats.org/drawingml/2006/wordprocessingDrawing" xmlns:w10="urn:schemas-microsoft-com:office:word" xmlns:w="http://schemas.openxmlformats.org/wordprocessingml/2006/main" xmlns:w14="http://schemas.microsoft.com/office/word/2010/wordml" xmlns:w15="http://schemas.microsoft.com/office/word/2012/wordml" xmlns:w16cex="http://schemas.microsoft.com/office/word/2018/wordml/cex" xmlns:w16cid="http://schemas.microsoft.com/office/word/2016/wordml/cid" xmlns:w16="http://schemas.microsoft.com/office/word/2018/wordml" xmlns:w16sdtdh="http://schemas.microsoft.com/office/word/2020/wordml/sdtdatahash" xmlns:w16se="http://schemas.microsoft.com/office/word/2015/wordml/symex" xmlns:wpg="http://schemas.microsoft.com/office/word/2010/wordprocessingGroup" xmlns:wpi="http://schemas.microsoft.com/office/word/2010/wordprocessingInk" xmlns:wne="http://schemas.microsoft.com/office/word/2006/wordml" xmlns:wps="http://schemas.microsoft.com/office/word/2010/wordprocessingShape" mc:Ignorable="w14 w15 w16se w16cid w16 w16cex w16sdtdh wp14">
   <w:abstractNum w:abstractNumId="0" w15:restartNumberingAfterBreak="0">
     <w:nsid w:val="10954AD6"/>
     <w:multiLevelType w:val="multilevel"/>
@@ -1859,16 +1832,16 @@
       </w:rPr>
     </w:lvl>
   </w:abstractNum>
-  <w:num w:numId="1">
+  <w:num w:numId="1" w16cid:durableId="1290092063">
     <w:abstractNumId w:val="1"/>
   </w:num>
-  <w:num w:numId="2">
+  <w:num w:numId="2" w16cid:durableId="1938756149">
     <w:abstractNumId w:val="3"/>
   </w:num>
-  <w:num w:numId="3">
+  <w:num w:numId="3" w16cid:durableId="512570223">
     <w:abstractNumId w:val="0"/>
   </w:num>
-  <w:num w:numId="4">
+  <w:num w:numId="4" w16cid:durableId="1260915287">
     <w:abstractNumId w:val="2"/>
   </w:num>
 </w:numbering>
@@ -1997,6 +1970,7 @@
     <w:lsdException w:name="HTML Sample" w:semiHidden="1" w:unhideWhenUsed="1"/>
     <w:lsdException w:name="HTML Typewriter" w:semiHidden="1" w:unhideWhenUsed="1"/>
     <w:lsdException w:name="HTML Variable" w:semiHidden="1" w:unhideWhenUsed="1"/>
+    <w:lsdException w:name="Normal Table" w:semiHidden="1" w:unhideWhenUsed="1"/>
     <w:lsdException w:name="annotation subject" w:semiHidden="1" w:unhideWhenUsed="1"/>
     <w:lsdException w:name="No List" w:semiHidden="1" w:unhideWhenUsed="1"/>
     <w:lsdException w:name="Outline List 1" w:semiHidden="1" w:unhideWhenUsed="1"/>
@@ -2039,8 +2013,11 @@
     <w:lsdException w:name="Table Contemporary" w:semiHidden="1" w:unhideWhenUsed="1"/>
     <w:lsdException w:name="Table Elegant" w:semiHidden="1" w:unhideWhenUsed="1"/>
     <w:lsdException w:name="Table Professional" w:semiHidden="1" w:unhideWhenUsed="1"/>
+    <w:lsdException w:name="Table Subtle 1" w:semiHidden="1" w:unhideWhenUsed="1"/>
     <w:lsdException w:name="Table Subtle 2" w:semiHidden="1" w:unhideWhenUsed="1"/>
     <w:lsdException w:name="Table Web 1" w:semiHidden="1" w:unhideWhenUsed="1"/>
+    <w:lsdException w:name="Table Web 2" w:semiHidden="1" w:unhideWhenUsed="1"/>
+    <w:lsdException w:name="Table Web 3" w:semiHidden="1" w:unhideWhenUsed="1"/>
     <w:lsdException w:name="Balloon Text" w:semiHidden="1" w:unhideWhenUsed="1"/>
     <w:lsdException w:name="Table Grid" w:uiPriority="39"/>
     <w:lsdException w:name="Table Theme" w:semiHidden="1" w:unhideWhenUsed="1"/>

</xml_diff>